<commit_message>
Strengthen repeated evaluation and project structure
</commit_message>
<xml_diff>
--- a/house_price_poly_regression_description_questions.docx
+++ b/house_price_poly_regression_description_questions.docx
@@ -87,7 +87,7 @@
           <w:sz w:val="21"/>
           <w:szCs w:val="21"/>
         </w:rPr>
-        <w:t xml:space="preserve">The objective is to decide whether first-order terms or added squared and interaction terms generalize better. The primary selection rule is the lowest mean five-fold cross-validated RMSE. An independent 80/20 holdout is reported as supporting evidence.</w:t>
+        <w:t xml:space="preserve">The objective is to decide whether first-order terms or added squared and interaction terms generalize better. The primary selection rule is the lowest mean RMSE across 25 matched splits from five-times repeated five-fold cross-validation. An independent 80/20 holdout is supporting evidence.</w:t>
       </w:r>
     </w:p>
     <w:p>
@@ -101,7 +101,7 @@
           <w:bCs/>
           <w:color w:val="17324D"/>
         </w:rPr>
-        <w:t xml:space="preserve">3. Five-fold cross-validation results</w:t>
+        <w:t xml:space="preserve">3. Repeated cross-validation results</w:t>
       </w:r>
     </w:p>
     <w:tbl>
@@ -290,7 +290,7 @@
                 <w:sz w:val="19"/>
                 <w:szCs w:val="19"/>
               </w:rPr>
-              <w:t xml:space="preserve">$17,661.62</w:t>
+              <w:t xml:space="preserve">$17,685.81</w:t>
             </w:r>
           </w:p>
         </w:tc>
@@ -314,7 +314,7 @@
                 <w:sz w:val="19"/>
                 <w:szCs w:val="19"/>
               </w:rPr>
-              <w:t xml:space="preserve">$25,784.67</w:t>
+              <w:t xml:space="preserve">$25,773.41</w:t>
             </w:r>
           </w:p>
         </w:tc>
@@ -338,7 +338,7 @@
                 <w:sz w:val="19"/>
                 <w:szCs w:val="19"/>
               </w:rPr>
-              <w:t xml:space="preserve">0.8925</w:t>
+              <w:t xml:space="preserve">0.8930</w:t>
             </w:r>
           </w:p>
         </w:tc>
@@ -412,7 +412,7 @@
                 <w:sz w:val="19"/>
                 <w:szCs w:val="19"/>
               </w:rPr>
-              <w:t xml:space="preserve">$18,089.54</w:t>
+              <w:t xml:space="preserve">$18,238.90</w:t>
             </w:r>
           </w:p>
         </w:tc>
@@ -436,7 +436,7 @@
                 <w:sz w:val="19"/>
                 <w:szCs w:val="19"/>
               </w:rPr>
-              <w:t xml:space="preserve">$27,150.27</w:t>
+              <w:t xml:space="preserve">$27,335.27</w:t>
             </w:r>
           </w:p>
         </w:tc>
@@ -460,7 +460,7 @@
                 <w:sz w:val="19"/>
                 <w:szCs w:val="19"/>
               </w:rPr>
-              <w:t xml:space="preserve">0.8799</w:t>
+              <w:t xml:space="preserve">0.8795</w:t>
             </w:r>
           </w:p>
         </w:tc>
@@ -843,7 +843,7 @@
           <w:sz w:val="21"/>
           <w:szCs w:val="21"/>
         </w:rPr>
-        <w:t xml:space="preserve">Degree 1 is selected. It has lower five-fold CV MAE and RMSE and higher five-fold CV R2. Degree 2 is narrowly better on the single holdout, but that isolated result is more sensitive to the chosen split. Degree 1 also uses only 16 terms rather than 152, making it the more stable and parsimonious choice.</w:t>
+        <w:t xml:space="preserve">Degree 1 is selected. It wins 84% of 25 matched splits and lowers RMSE by $1,561.86 on average; the approximate 95% difference interval is $972.61 to $2,151.10. Degree 2 is narrowly better on the single holdout, but Degree 1 is more stable and uses only 16 terms rather than 152.</w:t>
       </w:r>
     </w:p>
     <w:p>
@@ -946,7 +946,7 @@
           <w:sz w:val="21"/>
           <w:szCs w:val="21"/>
         </w:rPr>
-        <w:t xml:space="preserve">4. Why is five-fold cross-validation more reliable than one holdout split?</w:t>
+        <w:t xml:space="preserve">4. Why is five-times repeated five-fold cross-validation more reliable than one holdout split?</w:t>
       </w:r>
     </w:p>
     <w:p>

</xml_diff>